<commit_message>
Cut the method schematic; renumber to four figures
Author's call on the drawing. Methods 2.8 and 2.9 already state the wrapper's
control flow and the ladder construction in prose, so nothing argued in the text
loses its only visual support.

Adds a figure-numbering gate: legends must run 1..N with no gap, no body
reference may name a figure without a legend, and no figure may have a legend
without a body reference. The last of those failed on the first run -- the
refined-metric bar chart was cited only from inside another figure's legend and
never from the text, which predates this edit. Now cited in Section 3.8.
</commit_message>
<xml_diff>
--- a/paper/mam/manuscript.docx
+++ b/paper/mam/manuscript.docx
@@ -617,7 +617,7 @@
         <w:pStyle w:val="FirstParagraph"/>
       </w:pPr>
       <w:r>
-        <w:t xml:space="preserve">Table 1 reports the headline comparison across all 187 pairs, and Figure 2 plots the same data with Wilson intervals. The classical baselines reproduce the benchmark’s own finding: SIFT succeeds on 3 of 187 pairs, and mutual-information intensity refinement moves the median ED by 80 px without flipping a single pair to success. Among zero-shot foundation matchers RoMa is the strongest single backbone, and MatchAnything-RoMa is nominally stronger still.</w:t>
+        <w:t xml:space="preserve">Table 1 reports the headline comparison across all 187 pairs, and Figure 1 plots the same data with Wilson intervals. The classical baselines reproduce the benchmark’s own finding: SIFT succeeds on 3 of 187 pairs, and mutual-information intensity refinement moves the median ED by 80 px without flipping a single pair to success. Among zero-shot foundation matchers RoMa is the strongest single backbone, and MatchAnything-RoMa is nominally stronger still.</w:t>
       </w:r>
     </w:p>
     <w:bookmarkEnd w:id="23"/>
@@ -693,7 +693,7 @@
         <w:pStyle w:val="FirstParagraph"/>
       </w:pPr>
       <w:r>
-        <w:t xml:space="preserve">We redesigned the wrapper so that it never pools blindly (pyramid v2; Figure 1a). Because it accepts a candidate only if a mutual-information verifier scores it above the incumbent, the design is monotone with respect to its own verifier: tile noise cannot displace a direct fit the verifier prefers.</w:t>
+        <w:t xml:space="preserve">We redesigned the wrapper so that it never pools blindly (pyramid v2). Because it accepts a candidate only if a mutual-information verifier scores it above the incumbent, the design is monotone with respect to its own verifier: tile noise cannot displace a direct fit the verifier prefers.</w:t>
       </w:r>
     </w:p>
     <w:p>
@@ -854,7 +854,7 @@
         <w:t xml:space="preserve"> </w:t>
       </w:r>
       <w:r>
-        <w:t xml:space="preserve">= 0.0028), a threefold increase (Figure 3). On pairs held out of fine-tuning the effect is stronger still, 0.045 → 0.227 (</w:t>
+        <w:t xml:space="preserve">= 0.0028), a threefold increase (Figure 2). On pairs held out of fine-tuning the effect is stronger still, 0.045 → 0.227 (</w:t>
       </w:r>
       <w:r>
         <w:rPr>
@@ -1242,7 +1242,7 @@
         <w:t xml:space="preserve"> </w:t>
       </w:r>
       <w:r>
-        <w:t xml:space="preserve">= 0.035 refined (Table 4). Two publishable-looking results and two null results, from the same runs, the same pairs and the same bootstrap, differing only in whether an optional spline was applied before measuring.</w:t>
+        <w:t xml:space="preserve">= 0.035 refined (Table 4). Two publishable-looking results and two null results, from the same runs, the same pairs and the same bootstrap, differing only in whether an optional spline was applied before measuring. Figure 4 plots the nine configurations under the refined metric; set beside Figure 1, which is the same nine under the unrefined metric, it is the whole of the effect in one view.</w:t>
       </w:r>
     </w:p>
     <w:p>
@@ -2894,7 +2894,7 @@
         <w:t xml:space="preserve"> </w:t>
       </w:r>
       <w:r>
-        <w:t xml:space="preserve">Success at 10 px by native field-of-view stratum, unrefined error. Every configuration is at the floor in the extreme-FOV stratum. The wrapper’s low-FOV gain and high-FOV loss on RoMa are visible as 1 → 2 and 15 → 14. Across the 61 pairs below area ratio 0.5, no configuration registers more than three. Figure 4 plots these with intervals.</w:t>
+        <w:t xml:space="preserve">Success at 10 px by native field-of-view stratum, unrefined error. Every configuration is at the floor in the extreme-FOV stratum. The wrapper’s low-FOV gain and high-FOV loss on RoMa are visible as 1 → 2 and 15 → 14. Across the 61 pairs below area ratio 0.5, no configuration registers more than three. Figure 3 plots these with intervals.</w:t>
       </w:r>
     </w:p>
     <w:tbl>
@@ -4540,27 +4540,95 @@
         <w:t xml:space="preserve"> </w:t>
       </w:r>
       <w:r>
-        <w:t xml:space="preserve">Method schematic. (</w:t>
-      </w:r>
+        <w:t xml:space="preserve">Success rates across all nine configurations, unrefined parametric error, all 187 pairs. Error bars are 95 % Wilson score intervals. Pyramid v1 collapses RoMa; pyramid v2 restores it to parity. The intervals overlap throughout the dense-matcher rows, which is the honest summary of the native-pair comparison: nothing here is separated. Figure 4 shows the same panel under the refined metric, where two contrasts become significant.</w:t>
+      </w:r>
+    </w:p>
+    <w:p>
+      <w:pPr>
+        <w:pStyle w:val="BodyText"/>
+      </w:pPr>
+      <w:r>
+        <w:rPr>
+          <w:i/>
+          <w:iCs/>
+        </w:rPr>
+        <w:t xml:space="preserve">Alt text:</w:t>
+      </w:r>
+      <w:r>
+        <w:t xml:space="preserve"> </w:t>
+      </w:r>
+      <w:r>
+        <w:t xml:space="preserve">Grouped bar chart of success rate at 5, 10 and 20 pixels for nine registration configurations, with 95 percent Wilson confidence intervals. The classical SIFT baselines sit near zero. The RoMa-family bars are the tallest but their intervals overlap one another. The pyramid v1 bar collapses to near zero, far below the other dense-matcher bars.</w:t>
+      </w:r>
+    </w:p>
+    <w:p>
+      <w:pPr>
+        <w:pStyle w:val="BodyText"/>
+      </w:pPr>
       <w:r>
         <w:rPr>
           <w:b/>
           <w:bCs/>
         </w:rPr>
-        <w:t xml:space="preserve">A</w:t>
-      </w:r>
-      <w:r>
-        <w:t xml:space="preserve">) The verified coarse-to-fine wrapper (pyramid v2). A direct match establishes an incumbent transform; candidate stages — tile search over a scaled source grid, then zoom refinement on the best-scoring region — are invoked only when direct support is weak, and a candidate is accepted only if a mutual-information-on-overlap verifier scores it above the incumbent. Correspondences are never pooled blindly across tiles. (</w:t>
-      </w:r>
+        <w:t xml:space="preserve">Figure 2.</w:t>
+      </w:r>
+      <w:r>
+        <w:t xml:space="preserve"> </w:t>
+      </w:r>
+      <w:r>
+        <w:t xml:space="preserve">Controlled field-of-view ladder, appearance held fixed, unrefined error. Cropping base-matchable pairs to shrinking field-of-view ratios shows direct matching collapsing between the 0.25 and 0.1 rungs, while the verified wrapper restores success at 0.1 (0.075 → 0.225,</w:t>
+      </w:r>
+      <w:r>
+        <w:t xml:space="preserve"> </w:t>
+      </w:r>
+      <w:r>
+        <w:rPr>
+          <w:i/>
+          <w:iCs/>
+        </w:rPr>
+        <w:t xml:space="preserve">p</w:t>
+      </w:r>
+      <w:r>
+        <w:t xml:space="preserve"> </w:t>
+      </w:r>
+      <w:r>
+        <w:t xml:space="preserve">= 0.0028). The ladder is measured on the unrefined metric, which is the only one meaningful at every rung: at 10 % field of view, refinement has almost no inliers to work with and near-zero effect.</w:t>
+      </w:r>
+    </w:p>
+    <w:p>
+      <w:pPr>
+        <w:pStyle w:val="BodyText"/>
+      </w:pPr>
+      <w:r>
+        <w:rPr>
+          <w:i/>
+          <w:iCs/>
+        </w:rPr>
+        <w:t xml:space="preserve">Alt text:</w:t>
+      </w:r>
+      <w:r>
+        <w:t xml:space="preserve"> </w:t>
+      </w:r>
+      <w:r>
+        <w:t xml:space="preserve">Line plot of success rate at 10 pixels against field-of-view area ratio on a descending axis from 0.5 to 0.02. The direct-matching curve falls steeply between the 0.25 and 0.1 rungs and reaches zero by 0.05. The wrapper curve stays above it, peaking at the 0.1 rung at roughly three times the direct value, before both collapse at the smallest ratios.</w:t>
+      </w:r>
+    </w:p>
+    <w:p>
+      <w:pPr>
+        <w:pStyle w:val="BodyText"/>
+      </w:pPr>
       <w:r>
         <w:rPr>
           <w:b/>
           <w:bCs/>
         </w:rPr>
-        <w:t xml:space="preserve">B</w:t>
-      </w:r>
-      <w:r>
-        <w:t xml:space="preserve">) Construction of the controlled field-of-view ladder. A base-matchable real pair is cropped to shrinking absolute area ratios while appearance, modality and pixel size are held fixed, so that scale is the only variable; full ground truth is retained so out-of-crop correspondences test extrapolation.</w:t>
+        <w:t xml:space="preserve">Figure 3.</w:t>
+      </w:r>
+      <w:r>
+        <w:t xml:space="preserve"> </w:t>
+      </w:r>
+      <w:r>
+        <w:t xml:space="preserve">Success at 10 px versus native field-of-view stratum, unrefined error, with per-stratum sample size and Wilson 95 % intervals. The extreme-FOV stratum holds four pairs, so its interval is very wide and nothing may be read from its point estimate. Every configuration is at the floor there.</w:t>
       </w:r>
     </w:p>
     <w:p>
@@ -4578,7 +4646,7 @@
         <w:t xml:space="preserve"> </w:t>
       </w:r>
       <w:r>
-        <w:t xml:space="preserve">A two-panel schematic. Panel A is a flow diagram of the verified coarse-to-fine wrapper. A wide-field source image and a narrow-field target image, drawn as squares whose sizes differ, both feed a frozen dense matcher; a robust fit yields an incumbent transform. A decision point asks whether direct support is weak: if not, the incumbent stands, and if so a tile search over a scaled source grid and a zoom refinement on the best region produce a candidate, which a mutual-information-on-overlap verifier admits only if it scores above the incumbent. Panel B shows a square standing for the source field of view, containing five nested squares whose areas are 0.5, 0.25, 0.1, 0.05 and 0.02 of it, identified in a key by line darkness. Small open circles scattered across the source field mark ground-truth correspondences, which are retained whether or not they fall inside a crop.</w:t>
+        <w:t xml:space="preserve">Plot of success rate at 10 pixels across four field-of-view strata for each configuration, with Wilson confidence intervals. All configurations sit at zero in the smallest stratum, where the interval is extremely wide because it contains only four pairs. Success rises only in the largest-field-of-view stratum.</w:t>
       </w:r>
     </w:p>
     <w:p>
@@ -4590,13 +4658,13 @@
           <w:b/>
           <w:bCs/>
         </w:rPr>
-        <w:t xml:space="preserve">Figure 2.</w:t>
-      </w:r>
-      <w:r>
-        <w:t xml:space="preserve"> </w:t>
-      </w:r>
-      <w:r>
-        <w:t xml:space="preserve">Success rates across all nine configurations, unrefined parametric error, all 187 pairs. Error bars are 95 % Wilson score intervals. Pyramid v1 collapses RoMa; pyramid v2 restores it to parity. The intervals overlap throughout the dense-matcher rows, which is the honest summary of the native-pair comparison: nothing here is separated. Figure 5 shows the same panel under the refined metric, where two contrasts become significant.</w:t>
+        <w:t xml:space="preserve">Figure 4.</w:t>
+      </w:r>
+      <w:r>
+        <w:t xml:space="preserve"> </w:t>
+      </w:r>
+      <w:r>
+        <w:t xml:space="preserve">The same nine configurations under the TPS-refined metric. Compare Figure 1. The dense rows separate more here than they do unrefined, and part of that separation is the coverage artefact described in Section 3.8: the four RoMa-family rows have 187/187 refinement coverage while the SIFT-plus-mutual-information control has 0/187 and is scored entirely on the unrefined fallback.</w:t>
       </w:r>
     </w:p>
     <w:p>
@@ -4614,131 +4682,7 @@
         <w:t xml:space="preserve"> </w:t>
       </w:r>
       <w:r>
-        <w:t xml:space="preserve">Grouped bar chart of success rate at 5, 10 and 20 pixels for nine registration configurations, with 95 percent Wilson confidence intervals. The classical SIFT baselines sit near zero. The RoMa-family bars are the tallest but their intervals overlap one another. The pyramid v1 bar collapses to near zero, far below the other dense-matcher bars.</w:t>
-      </w:r>
-    </w:p>
-    <w:p>
-      <w:pPr>
-        <w:pStyle w:val="BodyText"/>
-      </w:pPr>
-      <w:r>
-        <w:rPr>
-          <w:b/>
-          <w:bCs/>
-        </w:rPr>
-        <w:t xml:space="preserve">Figure 3.</w:t>
-      </w:r>
-      <w:r>
-        <w:t xml:space="preserve"> </w:t>
-      </w:r>
-      <w:r>
-        <w:t xml:space="preserve">Controlled field-of-view ladder, appearance held fixed, unrefined error. Cropping base-matchable pairs to shrinking field-of-view ratios shows direct matching collapsing between the 0.25 and 0.1 rungs, while the verified wrapper restores success at 0.1 (0.075 → 0.225,</w:t>
-      </w:r>
-      <w:r>
-        <w:t xml:space="preserve"> </w:t>
-      </w:r>
-      <w:r>
-        <w:rPr>
-          <w:i/>
-          <w:iCs/>
-        </w:rPr>
-        <w:t xml:space="preserve">p</w:t>
-      </w:r>
-      <w:r>
-        <w:t xml:space="preserve"> </w:t>
-      </w:r>
-      <w:r>
-        <w:t xml:space="preserve">= 0.0028). The ladder is measured on the unrefined metric, which is the only one meaningful at every rung: at 10 % field of view, refinement has almost no inliers to work with and near-zero effect.</w:t>
-      </w:r>
-    </w:p>
-    <w:p>
-      <w:pPr>
-        <w:pStyle w:val="BodyText"/>
-      </w:pPr>
-      <w:r>
-        <w:rPr>
-          <w:i/>
-          <w:iCs/>
-        </w:rPr>
-        <w:t xml:space="preserve">Alt text:</w:t>
-      </w:r>
-      <w:r>
-        <w:t xml:space="preserve"> </w:t>
-      </w:r>
-      <w:r>
-        <w:t xml:space="preserve">Line plot of success rate at 10 pixels against field-of-view area ratio on a descending axis from 0.5 to 0.02. The direct-matching curve falls steeply between the 0.25 and 0.1 rungs and reaches zero by 0.05. The wrapper curve stays above it, peaking at the 0.1 rung at roughly three times the direct value, before both collapse at the smallest ratios.</w:t>
-      </w:r>
-    </w:p>
-    <w:p>
-      <w:pPr>
-        <w:pStyle w:val="BodyText"/>
-      </w:pPr>
-      <w:r>
-        <w:rPr>
-          <w:b/>
-          <w:bCs/>
-        </w:rPr>
-        <w:t xml:space="preserve">Figure 4.</w:t>
-      </w:r>
-      <w:r>
-        <w:t xml:space="preserve"> </w:t>
-      </w:r>
-      <w:r>
-        <w:t xml:space="preserve">Success at 10 px versus native field-of-view stratum, unrefined error, with per-stratum sample size and Wilson 95 % intervals. The extreme-FOV stratum holds four pairs, so its interval is very wide and nothing may be read from its point estimate. Every configuration is at the floor there.</w:t>
-      </w:r>
-    </w:p>
-    <w:p>
-      <w:pPr>
-        <w:pStyle w:val="BodyText"/>
-      </w:pPr>
-      <w:r>
-        <w:rPr>
-          <w:i/>
-          <w:iCs/>
-        </w:rPr>
-        <w:t xml:space="preserve">Alt text:</w:t>
-      </w:r>
-      <w:r>
-        <w:t xml:space="preserve"> </w:t>
-      </w:r>
-      <w:r>
-        <w:t xml:space="preserve">Plot of success rate at 10 pixels across four field-of-view strata for each configuration, with Wilson confidence intervals. All configurations sit at zero in the smallest stratum, where the interval is extremely wide because it contains only four pairs. Success rises only in the largest-field-of-view stratum.</w:t>
-      </w:r>
-    </w:p>
-    <w:p>
-      <w:pPr>
-        <w:pStyle w:val="BodyText"/>
-      </w:pPr>
-      <w:r>
-        <w:rPr>
-          <w:b/>
-          <w:bCs/>
-        </w:rPr>
-        <w:t xml:space="preserve">Figure 5.</w:t>
-      </w:r>
-      <w:r>
-        <w:t xml:space="preserve"> </w:t>
-      </w:r>
-      <w:r>
-        <w:t xml:space="preserve">The same nine configurations under the TPS-refined metric. Compare Figure 2. The dense rows separate more here than they do unrefined, and part of that separation is the coverage artefact described in Section 3.8: the four RoMa-family rows have 187/187 refinement coverage while the SIFT-plus-mutual-information control has 0/187 and is scored entirely on the unrefined fallback.</w:t>
-      </w:r>
-    </w:p>
-    <w:p>
-      <w:pPr>
-        <w:pStyle w:val="BodyText"/>
-      </w:pPr>
-      <w:r>
-        <w:rPr>
-          <w:i/>
-          <w:iCs/>
-        </w:rPr>
-        <w:t xml:space="preserve">Alt text:</w:t>
-      </w:r>
-      <w:r>
-        <w:t xml:space="preserve"> </w:t>
-      </w:r>
-      <w:r>
-        <w:t xml:space="preserve">The same grouped bar chart as Figure 2 but computed after thin-plate-spline refinement. The RoMa-family bars are visibly taller and separate more clearly from one another than in Figure 2, while the weak classical bars are essentially unchanged.</w:t>
+        <w:t xml:space="preserve">The same grouped bar chart as Figure 1 but computed after thin-plate-spline refinement. The RoMa-family bars are visibly taller and separate more clearly from one another than in Figure 1, while the weak classical bars are essentially unchanged.</w:t>
       </w:r>
     </w:p>
     <w:bookmarkEnd w:id="40"/>

</xml_diff>